<commit_message>
Actualización: Inclusión de datasets (.csv), documentación (.docx, .txt) y código fuente C++
</commit_message>
<xml_diff>
--- a/Desafio_2_16_04_2026.docx
+++ b/Desafio_2_16_04_2026.docx
@@ -2031,7 +2031,7 @@
     </w:p>
     <w:p>
       <w:pPr>
-        <w:jc w:val="both"/>
+        <w:jc w:val="center"/>
         <w:rPr>
           <w:rFonts w:ascii="ADLaM Display" w:hAnsi="ADLaM Display" w:cs="ADLaM Display"/>
           <w:sz w:val="22"/>
@@ -3568,7 +3568,7 @@
           <w:szCs w:val="22"/>
         </w:rPr>
         <w:drawing>
-          <wp:inline distT="0" distB="0" distL="0" distR="0" wp14:anchorId="3E472095" wp14:editId="2ABC4967">
+          <wp:inline distT="0" distB="0" distL="0" distR="0" wp14:anchorId="3E472095" wp14:editId="4FDBA195">
             <wp:extent cx="5943600" cy="3962400"/>
             <wp:effectExtent l="0" t="0" r="0" b="0"/>
             <wp:docPr id="819761067" name="Picture 3"/>

</xml_diff>